<commit_message>
book: contents page (manual ToC), drop stale pdf approach
</commit_message>
<xml_diff>
--- a/characters/laynlindr-freth/backstory/book/Soulknife.docx
+++ b/characters/laynlindr-freth/backstory/book/Soulknife.docx
@@ -39,6 +39,25 @@
           <w:sz w:val="28"/>
         </w:rPr>
         <w:t>†  †</w:t>
+      </w:r>
+    </w:p>
+    <w:p>
+      <w:r>
+        <w:br w:type="page"/>
+      </w:r>
+    </w:p>
+    <w:p/>
+    <w:p>
+      <w:pPr>
+        <w:spacing w:before="2000"/>
+        <w:jc w:val="center"/>
+      </w:pPr>
+      <w:r>
+        <w:rPr>
+          <w:b/>
+          <w:sz w:val="32"/>
+        </w:rPr>
+        <w:t>CONTENTS</w:t>
       </w:r>
     </w:p>
     <w:p>
@@ -62,6 +81,7 @@
     </w:p>
     <w:p>
       <w:pPr>
+        <w:pStyle w:val="Heading1"/>
         <w:spacing w:before="1200"/>
         <w:jc w:val="center"/>
       </w:pPr>
@@ -286,6 +306,7 @@
     </w:p>
     <w:p>
       <w:pPr>
+        <w:pStyle w:val="Heading1"/>
         <w:spacing w:before="1200"/>
         <w:jc w:val="center"/>
       </w:pPr>
@@ -775,6 +796,7 @@
     </w:p>
     <w:p>
       <w:pPr>
+        <w:pStyle w:val="Heading1"/>
         <w:spacing w:before="1200"/>
         <w:jc w:val="center"/>
       </w:pPr>
@@ -1124,6 +1146,7 @@
     </w:p>
     <w:p>
       <w:pPr>
+        <w:pStyle w:val="Heading1"/>
         <w:spacing w:before="1200"/>
         <w:jc w:val="center"/>
       </w:pPr>
@@ -1720,6 +1743,7 @@
     </w:p>
     <w:p>
       <w:pPr>
+        <w:pStyle w:val="Heading1"/>
         <w:spacing w:before="1200"/>
         <w:jc w:val="center"/>
       </w:pPr>
@@ -2090,6 +2114,7 @@
     </w:p>
     <w:p>
       <w:pPr>
+        <w:pStyle w:val="Heading1"/>
         <w:spacing w:before="1200"/>
         <w:jc w:val="center"/>
       </w:pPr>
@@ -2596,6 +2621,7 @@
     </w:p>
     <w:p>
       <w:pPr>
+        <w:pStyle w:val="Heading1"/>
         <w:spacing w:before="1200"/>
         <w:jc w:val="center"/>
       </w:pPr>
@@ -3207,6 +3233,7 @@
     </w:p>
     <w:p>
       <w:pPr>
+        <w:pStyle w:val="Heading1"/>
         <w:spacing w:before="1200"/>
         <w:jc w:val="center"/>
       </w:pPr>
@@ -3966,6 +3993,7 @@
     </w:p>
     <w:p>
       <w:pPr>
+        <w:pStyle w:val="Heading1"/>
         <w:spacing w:before="1200"/>
         <w:jc w:val="center"/>
       </w:pPr>
@@ -4629,6 +4657,7 @@
     </w:p>
     <w:p>
       <w:pPr>
+        <w:pStyle w:val="Heading1"/>
         <w:spacing w:before="1200"/>
         <w:jc w:val="center"/>
       </w:pPr>
@@ -5140,6 +5169,7 @@
     </w:p>
     <w:p>
       <w:pPr>
+        <w:pStyle w:val="Heading1"/>
         <w:spacing w:before="1600"/>
         <w:jc w:val="center"/>
       </w:pPr>

</xml_diff>

<commit_message>
book: add render workflow (docx+pdf on push); fix ch11 heading/filename; portable make_docx path
</commit_message>
<xml_diff>
--- a/characters/laynlindr-freth/backstory/book/Soulknife.docx
+++ b/characters/laynlindr-freth/backstory/book/Soulknife.docx
@@ -112,6 +112,200 @@
     </w:p>
     <w:p>
       <w:r>
+        <w:t>The first time Layn was allowed out of the house, he was five, and he was not allowed to do anything in it except follow.</w:t>
+      </w:r>
+    </w:p>
+    <w:p>
+      <w:r>
+        <w:t>His nurse walked half a step ahead of him through the compound's gate, a basket on her hip, a message tube at her belt. She was old for a servant and silent for anyone, and in the years he had known her, Layn could count the words she had spent on him without losing his place. She did not look back to see whether he followed. She never had to.</w:t>
+      </w:r>
+    </w:p>
+    <w:p>
+      <w:r>
+        <w:t>They crossed the bridge into the city, and Layn forgot to be obedient for the length of one heartbeat.</w:t>
+      </w:r>
+    </w:p>
+    <w:p>
+      <w:r>
+        <w:t>There was no sky above Menzoberranzan. He had always known it the way one knows a wall one has never climbed, but knowing it from a doorway and seeing it from a bridge were different things. Stone rose above the city so far that his eyes slid off it before finding an end, and the columns that held the roof up were not pillars but mountains stood on end, and between them, far over his head, walked other bridges where other people were going about their days — upside down, it seemed to him, a second city hanging above the first, lit in cold blue and violet fire.</w:t>
+      </w:r>
+    </w:p>
+    <w:p>
+      <w:r>
+        <w:t>A city above a city. Nobody falling. Nobody even careful.</w:t>
+      </w:r>
+    </w:p>
+    <w:p>
+      <w:r>
+        <w:t>His nurse did not stop. He ran two steps to catch up.</w:t>
+      </w:r>
+    </w:p>
+    <w:p>
+      <w:r>
+        <w:t>The light of Menzoberranzan came from everywhere and defeated nothing. Faerie fire burned along the edges of towers and gates and house compounds, outlining the city so it could be read, and pale fungi clung to the deeper walls and glowed where nothing else would. But the dark between the lights kept its own weight, and Layn learned his first lesson within sight of his own house: a balcony could disappear behind a veil of shadow, and a bridge could appear to end where in truth it bent into blackness, and a doorway could stand open on a street for years while no passing eye noticed what lay beyond it.</w:t>
+      </w:r>
+    </w:p>
+    <w:p>
+      <w:r>
+        <w:t>His nurse noticed.</w:t>
+      </w:r>
+    </w:p>
+    <w:p>
+      <w:r>
+        <w:t>She stopped without breaking the rhythm of her walk, shifted the basket to her other hip, and looked at the front of a dark colonnade for the space of a breath. Layn followed her gaze and saw nothing at all. Then the nothing moved, apologized with both hands, and let them pass, and only when they were beyond it did Layn understand that the shape had been a person, a watcher, someone paid to stand in shadow — and that his nurse had seen him before Layn had even known there was a he.</w:t>
+      </w:r>
+    </w:p>
+    <w:p>
+      <w:r>
+        <w:t>She had not looked with her eyes. She had looked with the other thing, the thing all drow had: warmth, read like color in the dark. A body was a lamp to a drow, and a hidden body was a lamp behind a curtain, and the curtain was never thick enough. A hand resting on a weapon glowed.</w:t>
+      </w:r>
+    </w:p>
+    <w:p>
+      <w:r>
+        <w:t>The dark was not empty. His nurse had never thought it was. Neither, now, did Layn.</w:t>
+      </w:r>
+    </w:p>
+    <w:p>
+      <w:r>
+        <w:t>They went down into the Bazaar, into Duthcloim, and the city stopped being a picture and became a noise. Voices traded over one another in four languages and a half-dozen silences. The smells came in layers: cooked fungus and hot metal, tanning acids, sweet rot, and under all of it the iron-smell of the slave pens. Slaves carried crates through the press of bodies. Behind a stall, a duergar merchant and a drow argued over a shipment with the pleasant faces of people who would each have poisoned the other for less, while a goblin waited behind the duergar with the next load and watched the crowd the way his master did not.</w:t>
+      </w:r>
+    </w:p>
+    <w:p>
+      <w:r>
+        <w:t>Guards watched everything without seeming to watch anything. Layn tried to find one who was watching the wrong way, and failed, and understood that finding one was probably the test.</w:t>
+      </w:r>
+    </w:p>
+    <w:p>
+      <w:r>
+        <w:t>Everything in the Bazaar was for sale if one had the coin, or the connections, or knew which merchant could be asked. Layn had none of the three. He watched his nurse pay for herbs by setting the coins down without a word, watched the herb-seller count them without a word, and understood that the city had a whole language made of not speaking, and that his nurse was fluent, and that he was not.</w:t>
+      </w:r>
+    </w:p>
+    <w:p>
+      <w:r>
+        <w:t>She was fluent in the other language too.</w:t>
+      </w:r>
+    </w:p>
+    <w:p>
+      <w:r>
+        <w:t>A warrior coming up the street changed his posture before Layn had seen anything to change it for. Then the reason came: a priestess, walking with two guards, her robes marked with a house emblem that Layn knew from the walls of his own home. The crowd opened before her without being told. A merchant two stalls over looked at the emblem before he looked at her face, and priced his bow accordingly, lower. A servant across the way read the rank of a passing noble by her clothing, her weapons, and the way the people around her moved, and stepped back a half-second before the noble's path required it.</w:t>
+      </w:r>
+    </w:p>
+    <w:p>
+      <w:r>
+        <w:t>People knew how to make room. Nobody had ever taught them; they had learned as children, because everyone around them already knew. The city did not explain its power. It demonstrated it, all day, everywhere, in the path someone cleared or did not, in the doorway someone was not standing in.</w:t>
+      </w:r>
+    </w:p>
+    <w:p>
+      <w:r>
+        <w:t>They crossed out of Duthcloim into Narbondellyn, where the streets widened and the houses stopped defending themselves and began displaying instead — elegant estates, artisan shops, metals and stones worn where they would be seen, rank carved in the architecture for anyone fluent. Beyond, screened by enormous mushrooms and by distance, lay Qu'ellarz'orl, the heights where the great houses sat, where commoners did not wander and even Layn, who was not a commoner, had been allowed only to look.</w:t>
+      </w:r>
+    </w:p>
+    <w:p>
+      <w:r>
+        <w:t>At the center of it all rose Narbondel, the city's clock, a pillar of stone taller than any tower. He could not see its top from here, but he could see the band of warmth that was climbing it — the Archmage's fire, laid into the stone each morning, rising through the day while the whole city watched it the way surface folk watched a sun. His nurse glanced at it once, mid-street, to know the hour. When the warmth reached the top and died, the city would go dark, and the dark was the same dark that had been there all along. There was no night in Menzoberranzan. The day simply ended and the truth resumed.</w:t>
+      </w:r>
+    </w:p>
+    <w:p>
+      <w:r>
+        <w:t>Near the pillar's base, a beggar — Layn's nurse called such people by other words — had set out trays of dead things: beetles, lizards, a spider with legs like wire. Souvenirs for soft-minded traders. One of the dead spiders was as long as Layn's forearm, and Layn felt his own size the way he felt it nowhere else, under the carved bodies of the ones in the temple district, above the gates, in the emblems on every second banner. Spiders were the city's alphabet. Some were beautiful, some were grotesque, and a child learned early that there were things it was wiser to observe than to touch, even when they were only stone.</w:t>
+      </w:r>
+    </w:p>
+    <w:p>
+      <w:r>
+        <w:t xml:space="preserve">Once, on the walk back, his nurse took a longer road, and on that road stood a doorway whose lintel still bore the emblem of a house that no longer existed. The stone was old and the emblem had been cut deep, deliberately deep, by people who had wanted it to outlast the house. It had. Layn stopped to look, and his nurse let him, and he understood without anyone explaining it that the house had not merely fallen; it had been </w:t>
+      </w:r>
+      <w:r>
+        <w:rPr>
+          <w:i/>
+        </w:rPr>
+        <w:t>answered</w:t>
+      </w:r>
+      <w:r>
+        <w:t>, in a city that kept its grudges longer than its people. A drow lived centuries. Menzoberranzan lived longer. A murder from three generations back was still a name, still a weight in a doorway, still a reason a certain family traded at a certain stall and nowhere else.</w:t>
+      </w:r>
+    </w:p>
+    <w:p>
+      <w:r>
+        <w:t>The city remembered. Sometimes the living did not.</w:t>
+      </w:r>
+    </w:p>
+    <w:p>
+      <w:r>
+        <w:t>They were nearly home when he tried, once, the question he had carried all day.</w:t>
+      </w:r>
+    </w:p>
+    <w:p>
+      <w:r>
+        <w:t>“Why did you look at the colonnade?”</w:t>
+      </w:r>
+    </w:p>
+    <w:p>
+      <w:r>
+        <w:t>His nurse did not answer. Layn had not expected her to; he had wanted her to, and the distance between those two things was the whole size of his life so far. She turned through the compound gate, and Layn looked back once, the way he was not supposed to, at the second city hanging above the first, at the band of heat climbing the pillar, at the faerie fire reading the dark.</w:t>
+      </w:r>
+    </w:p>
+    <w:p>
+      <w:r>
+        <w:t>Everything in the city was caught in something. The streets in the houses, the houses in the ranks, the ranks in the spider's shape, the dark in the light's edges, and all of it, somewhere far above and behind, held in a web he could feel but not see.</w:t>
+      </w:r>
+    </w:p>
+    <w:p>
+      <w:r>
+        <w:t>He went in. The gate closed behind him, and the city went on being watched.</w:t>
+      </w:r>
+    </w:p>
+    <w:p>
+      <w:r>
+        <w:br w:type="page"/>
+      </w:r>
+    </w:p>
+    <w:p>
+      <w:pPr>
+        <w:spacing w:before="1200"/>
+        <w:jc w:val="center"/>
+      </w:pPr>
+      <w:r>
+        <w:rPr>
+          <w:rFonts w:ascii="Garamond" w:hAnsi="Garamond"/>
+          <w:color w:val="404040"/>
+          <w:sz w:val="28"/>
+        </w:rPr>
+        <w:t>Chapter 1</w:t>
+      </w:r>
+    </w:p>
+    <w:p>
+      <w:pPr>
+        <w:pStyle w:val="Heading1"/>
+        <w:spacing w:before="1200"/>
+        <w:jc w:val="center"/>
+      </w:pPr>
+      <w:r>
+        <w:rPr>
+          <w:rFonts w:ascii="Garamond" w:hAnsi="Garamond"/>
+          <w:color w:val="404040"/>
+          <w:sz w:val="44"/>
+        </w:rPr>
+        <w:t>Menzoberranzan</w:t>
+      </w:r>
+    </w:p>
+    <w:p>
+      <w:pPr>
+        <w:spacing w:before="280"/>
+        <w:jc w:val="center"/>
+      </w:pPr>
+      <w:r>
+        <w:rPr>
+          <w:rFonts w:ascii="Garamond" w:hAnsi="Garamond"/>
+          <w:sz w:val="24"/>
+        </w:rPr>
+        <w:t>†  †</w:t>
+      </w:r>
+    </w:p>
+    <w:p>
+      <w:pPr/>
+    </w:p>
+    <w:p>
+      <w:r>
         <w:t>There was no sky above Menzoberranzan, and there had never been one. There was only stone, rising so far above the city that even the sharpest eyes could not find where the cavern ended and darkness began. Menzoberranzan occupied a vast, arrowhead-shaped cavern, its roof nearly a thousand feet above the floor, while great columns and jutting shelves of calcite divided the space into layers. Bridges and walkways crossed the emptiness between them, joining towers carved directly from the living rock.</w:t>
       </w:r>
     </w:p>
@@ -5160,6 +5354,492 @@
     <w:p>
       <w:r>
         <w:t>“Keep him alive.” She offered no explanation and waited for no response before she was gone.</w:t>
+      </w:r>
+    </w:p>
+    <w:p>
+      <w:r>
+        <w:br w:type="page"/>
+      </w:r>
+    </w:p>
+    <w:p>
+      <w:pPr>
+        <w:spacing w:before="1200"/>
+        <w:jc w:val="center"/>
+      </w:pPr>
+      <w:r>
+        <w:rPr>
+          <w:rFonts w:ascii="Garamond" w:hAnsi="Garamond"/>
+          <w:color w:val="404040"/>
+          <w:sz w:val="28"/>
+        </w:rPr>
+        <w:t>Chapter 11</w:t>
+      </w:r>
+    </w:p>
+    <w:p>
+      <w:pPr>
+        <w:pStyle w:val="Heading1"/>
+        <w:spacing w:before="1200"/>
+        <w:jc w:val="center"/>
+      </w:pPr>
+      <w:r>
+        <w:rPr>
+          <w:rFonts w:ascii="Garamond" w:hAnsi="Garamond"/>
+          <w:color w:val="404040"/>
+          <w:sz w:val="44"/>
+        </w:rPr>
+        <w:t>Conspiracy</w:t>
+      </w:r>
+    </w:p>
+    <w:p>
+      <w:pPr>
+        <w:spacing w:before="280"/>
+        <w:jc w:val="center"/>
+      </w:pPr>
+      <w:r>
+        <w:rPr>
+          <w:rFonts w:ascii="Garamond" w:hAnsi="Garamond"/>
+          <w:sz w:val="24"/>
+        </w:rPr>
+        <w:t>†  †</w:t>
+      </w:r>
+    </w:p>
+    <w:p>
+      <w:pPr/>
+    </w:p>
+    <w:p>
+      <w:r>
+        <w:t>“Psionic?” asked Dreydre.</w:t>
+      </w:r>
+    </w:p>
+    <w:p>
+      <w:r>
+        <w:t>“Possibly,” said Greyanna.</w:t>
+      </w:r>
+    </w:p>
+    <w:p>
+      <w:r>
+        <w:t>The Matron Mother stood before them in perfect composure, though only a few weeks had passed since she had given birth to the youngest male of House Freth.</w:t>
+      </w:r>
+    </w:p>
+    <w:p>
+      <w:r>
+        <w:t>Laynlindr Freth was still too young to speak. He slept in the chamber beyond the inner doors, watched by servants who had been instructed to report anything unusual.</w:t>
+      </w:r>
+    </w:p>
+    <w:p>
+      <w:r>
+        <w:t>Dreydre was the first to speak again.</w:t>
+      </w:r>
+    </w:p>
+    <w:p>
+      <w:r>
+        <w:t>“If it is true, he could become dangerous.”</w:t>
+      </w:r>
+    </w:p>
+    <w:p>
+      <w:r>
+        <w:t>“Or uncontrollable,” Greyanna added with equal concern.</w:t>
+      </w:r>
+    </w:p>
+    <w:p>
+      <w:r>
+        <w:t>The Matron Mother listened without interrupting.</w:t>
+      </w:r>
+    </w:p>
+    <w:p>
+      <w:r>
+        <w:t>Neither sister spoke for a moment.</w:t>
+      </w:r>
+    </w:p>
+    <w:p>
+      <w:r>
+        <w:t>“Then we should kill him now and avoid all risk,” Dreydre said.</w:t>
+      </w:r>
+    </w:p>
+    <w:p>
+      <w:r>
+        <w:t>Greyanna looked at her sister, then toward the doors again. “Before he reaches.”</w:t>
+      </w:r>
+    </w:p>
+    <w:p>
+      <w:r>
+        <w:t>The Matron Mother turned her gaze upon them.</w:t>
+      </w:r>
+    </w:p>
+    <w:p>
+      <w:r>
+        <w:t>“In this child lies the work of Lolth.”</w:t>
+      </w:r>
+    </w:p>
+    <w:p>
+      <w:r>
+        <w:t>The sisters fell silent.</w:t>
+      </w:r>
+    </w:p>
+    <w:p>
+      <w:r>
+        <w:t>“If she has placed such power within the boy, then we will not destroy it before understanding why. We will not act in haste and risk bringing Lolth's displeasure upon us.”</w:t>
+      </w:r>
+    </w:p>
+    <w:p>
+      <w:r>
+        <w:t>She paused, allowing her words to sink in.</w:t>
+      </w:r>
+    </w:p>
+    <w:p>
+      <w:r>
+        <w:t>“We will welcome her gift. It is now our task to determine how we are to use it.”</w:t>
+      </w:r>
+    </w:p>
+    <w:p>
+      <w:r>
+        <w:t>Dreydre's eyes sparked.</w:t>
+      </w:r>
+    </w:p>
+    <w:p>
+      <w:r>
+        <w:t>“Otherwise, we risk bringing her rage upon us by interfering in her divine work,” Dreydre said.</w:t>
+      </w:r>
+    </w:p>
+    <w:p>
+      <w:r>
+        <w:t>The Matron Mother gave her a brief look.</w:t>
+      </w:r>
+    </w:p>
+    <w:p>
+      <w:r>
+        <w:t>“You should have understood that by now.”</w:t>
+      </w:r>
+    </w:p>
+    <w:p>
+      <w:r>
+        <w:t>A figure appeared in the doorway.</w:t>
+      </w:r>
+    </w:p>
+    <w:p>
+      <w:r>
+        <w:t>Zilvrae entered, bowed once, and waited.</w:t>
+      </w:r>
+    </w:p>
+    <w:p>
+      <w:r>
+        <w:t>“You have summoned me, Matron Mother.”</w:t>
+      </w:r>
+    </w:p>
+    <w:p>
+      <w:r>
+        <w:t>Her eyes moved briefly between the Matron Mother and the two daughters. The sisters' expressions were more annoyed than usual.</w:t>
+      </w:r>
+    </w:p>
+    <w:p>
+      <w:r>
+        <w:t>“We require your knowledge. What we are dealing with is within your domain, after all.”</w:t>
+      </w:r>
+    </w:p>
+    <w:p>
+      <w:r>
+        <w:t>The final words carried just enough weight to make the remark something other than courtesy.</w:t>
+      </w:r>
+    </w:p>
+    <w:p>
+      <w:r>
+        <w:t>Zilvrae did not react.</w:t>
+      </w:r>
+    </w:p>
+    <w:p>
+      <w:r>
+        <w:t>“Training?”</w:t>
+      </w:r>
+    </w:p>
+    <w:p>
+      <w:r>
+        <w:t>“Younglings,” the Matron Mother said.</w:t>
+      </w:r>
+    </w:p>
+    <w:p>
+      <w:r>
+        <w:t>The Matron Mother's gaze remained on her.</w:t>
+      </w:r>
+    </w:p>
+    <w:p>
+      <w:r>
+        <w:t>“There are ambiguous signs that the youngest male may be psionic.”</w:t>
+      </w:r>
+    </w:p>
+    <w:p>
+      <w:r>
+        <w:t>Zilvrae thought for a second.</w:t>
+      </w:r>
+    </w:p>
+    <w:p>
+      <w:r>
+        <w:t>“I can recognize psionic manifestations, but I cannot look at an infant and tell you what his mind may become. What you seek requires a psionic scholar's expertise.”</w:t>
+      </w:r>
+    </w:p>
+    <w:p>
+      <w:r>
+        <w:t>All that was already clear to the Matron Mother.</w:t>
+      </w:r>
+    </w:p>
+    <w:p>
+      <w:r>
+        <w:t>“Then tell me this,” said the Matron Mother. “How would you determine whether the power is there? In your experience, you should have seen many children manifest their gifts.”</w:t>
+      </w:r>
+    </w:p>
+    <w:p>
+      <w:r>
+        <w:t>Zilvrae considered the question.</w:t>
+      </w:r>
+    </w:p>
+    <w:p>
+      <w:r>
+        <w:t>“I have never had a psionic student. But assuming my understanding of psionic powers is even remotely correct, then there is a direct way, and there is a safe way,” she said. “However, these two do not align.”</w:t>
+      </w:r>
+    </w:p>
+    <w:p>
+      <w:r>
+        <w:t>Greyanna folded her arms.</w:t>
+      </w:r>
+    </w:p>
+    <w:p>
+      <w:r>
+        <w:t>The Matron Mother waited.</w:t>
+      </w:r>
+    </w:p>
+    <w:p>
+      <w:r>
+        <w:t>“The direct way,” Zilvrae said curtly, “is to attack him.”</w:t>
+      </w:r>
+    </w:p>
+    <w:p>
+      <w:r>
+        <w:t>The sisters stared at her.</w:t>
+      </w:r>
+    </w:p>
+    <w:p>
+      <w:r>
+        <w:t>“Powerfully enough to cause permanent damage, or destroy him entirely. Enough to force his instincts to answer before his mind understands what is happening. At his age, instinct governs almost everything.”</w:t>
+      </w:r>
+    </w:p>
+    <w:p>
+      <w:r>
+        <w:t>Zilvrae's voice remained level.</w:t>
+      </w:r>
+    </w:p>
+    <w:p>
+      <w:r>
+        <w:t>“If the power is present, he may manifest some form of barrier before his conscious mind even knows that it has done so. If the reaction is strong enough, the pressure may continue until the power breaks outward.”</w:t>
+      </w:r>
+    </w:p>
+    <w:p>
+      <w:r>
+        <w:t>She looked around the chamber.</w:t>
+      </w:r>
+    </w:p>
+    <w:p>
+      <w:r>
+        <w:t>“I would not recommend doing it in this gallery,” she added calmly. “If the manifestation is strong enough, you may have to rebuild it afterward.”</w:t>
+      </w:r>
+    </w:p>
+    <w:p>
+      <w:r>
+        <w:t>“The safest,” Zilvrae continued, “would be House Oblodra.”</w:t>
+      </w:r>
+    </w:p>
+    <w:p>
+      <w:r>
+        <w:t>Silence followed.</w:t>
+      </w:r>
+    </w:p>
+    <w:p>
+      <w:r>
+        <w:t>Dreydre was the first to speak.</w:t>
+      </w:r>
+    </w:p>
+    <w:p>
+      <w:r>
+        <w:t>“You expect us to hand them a secret weapon?”</w:t>
+      </w:r>
+    </w:p>
+    <w:p>
+      <w:r>
+        <w:t>“No.”</w:t>
+      </w:r>
+    </w:p>
+    <w:p>
+      <w:r>
+        <w:t>Zilvrae looked at her directly.</w:t>
+      </w:r>
+    </w:p>
+    <w:p>
+      <w:r>
+        <w:t>“But I expect you to understand that they possess knowledge I do not.”</w:t>
+      </w:r>
+    </w:p>
+    <w:p>
+      <w:r>
+        <w:t>“And they would learn what House Freth possesses.”</w:t>
+      </w:r>
+    </w:p>
+    <w:p>
+      <w:r>
+        <w:t>“Unacceptable,” the Matron Mother whispered to herself.</w:t>
+      </w:r>
+    </w:p>
+    <w:p>
+      <w:r>
+        <w:t>“Of course,” said Zilvrae without arguing.</w:t>
+      </w:r>
+    </w:p>
+    <w:p>
+      <w:r>
+        <w:t>House Oblodra was among the most powerful Houses in Menzoberranzan, and its members possessed knowledge of the rare art of psionics. There was little doubt that they would be able to identify the boy's nature, its potential, perhaps even the limits of what he might become. But no drow House would open its secrets that way without revealing something valuable in return.</w:t>
+      </w:r>
+    </w:p>
+    <w:p>
+      <w:r>
+        <w:t>“Then there is the middle ground,” Zilvrae said.</w:t>
+      </w:r>
+    </w:p>
+    <w:p>
+      <w:r>
+        <w:t>All eyes in the room focused on her.</w:t>
+      </w:r>
+    </w:p>
+    <w:p>
+      <w:r>
+        <w:t>“Calmness.”</w:t>
+      </w:r>
+    </w:p>
+    <w:p>
+      <w:r>
+        <w:t>Greyanna's mouth tightened.</w:t>
+      </w:r>
+    </w:p>
+    <w:p>
+      <w:r>
+        <w:t>“As you all know, psionic power is a power of the mind,” Zilvrae said. “The mind of an infant has barely begun to distinguish itself from instinct. There is little to learn by forcing it.”</w:t>
+      </w:r>
+    </w:p>
+    <w:p>
+      <w:r>
+        <w:t>“Then what do you propose?” asked the Matron Mother.</w:t>
+      </w:r>
+    </w:p>
+    <w:p>
+      <w:r>
+        <w:t>“Patience. If the power is there, it will emerge organically. To my knowledge, it is not uncommon even for children who show signs of such powers to lose them by the time they begin to understand the world around them. Being born with the power is one thing. Retaining it is another. And I am not familiar with methods to steer the child toward one outcome or the other.”</w:t>
+      </w:r>
+    </w:p>
+    <w:p>
+      <w:r>
+        <w:t>The answer seemed almost deliberately simple.</w:t>
+      </w:r>
+    </w:p>
+    <w:p>
+      <w:r>
+        <w:t>Zilvrae continued before anyone could object.</w:t>
+      </w:r>
+    </w:p>
+    <w:p>
+      <w:r>
+        <w:t>“As he grows, he will begin to develop a will of his own. He will want things. Seek things. Refuse things. That is when the power, if it exists, will begin to show, shaped by the character of its wielder.”</w:t>
+      </w:r>
+    </w:p>
+    <w:p>
+      <w:r>
+        <w:t>The Matron Mother watched her closely.</w:t>
+      </w:r>
+    </w:p>
+    <w:p>
+      <w:r>
+        <w:t>Zilvrae looked toward the inner chamber.</w:t>
+      </w:r>
+    </w:p>
+    <w:p>
+      <w:r>
+        <w:t>The Matron Mother was silent for a long moment.</w:t>
+      </w:r>
+    </w:p>
+    <w:p>
+      <w:r>
+        <w:t>Then she turned to her daughters.</w:t>
+      </w:r>
+    </w:p>
+    <w:p>
+      <w:r>
+        <w:t>“You will be responsible for his training when he is old enough.”</w:t>
+      </w:r>
+    </w:p>
+    <w:p>
+      <w:r>
+        <w:t>Zilvrae inclined her head.</w:t>
+      </w:r>
+    </w:p>
+    <w:p>
+      <w:r>
+        <w:t>“You will not encourage him to look inward for answers. You will not speak to him of the power we suspect he possesses. You will not help him seek it.”</w:t>
+      </w:r>
+    </w:p>
+    <w:p>
+      <w:r>
+        <w:t>Even though Zilvrae's expression barely changed.</w:t>
+      </w:r>
+    </w:p>
+    <w:p>
+      <w:r>
+        <w:t>“Understood,” she said.</w:t>
+      </w:r>
+    </w:p>
+    <w:p>
+      <w:r>
+        <w:t>“Now, leave us.”</w:t>
+      </w:r>
+    </w:p>
+    <w:p>
+      <w:r>
+        <w:t>The tutor bowed, turned, and closed the doors to the Matron Mother's chambers behind her.</w:t>
+      </w:r>
+    </w:p>
+    <w:p>
+      <w:r>
+        <w:t>The Matron Mother's command had struck her. How far did the potential of that boy reach, and how much of it would be limited by this conspiracy? She had always despised the way the members of noble Houses treated their children. Nevertheless, that was the state of things in Menzoberranzan. She would oblige the Matron Mother's orders, but she would use every possible opportunity to instill her own beliefs in the young boy. In the experienced tutor's mind, some lessons were more useful than knowing how to wield blades. Lessons that no drow—least of all a female—would dare convey.</w:t>
+      </w:r>
+    </w:p>
+    <w:p>
+      <w:pPr>
+        <w:spacing w:before="240"/>
+      </w:pPr>
+    </w:p>
+    <w:p>
+      <w:pPr/>
+      <w:r>
+        <w:t>“You will watch him,” the Matron Mother said, turning to the sisters after Zilvrae left.</w:t>
+      </w:r>
+    </w:p>
+    <w:p>
+      <w:r>
+        <w:t>Dreydre's expression hardened.</w:t>
+      </w:r>
+    </w:p>
+    <w:p>
+      <w:r>
+        <w:t>“From a distance,” the Matron Mother continued. “You will observe. You will not provoke him. You will not frighten him. You will not hurt him merely to produce evidence.”</w:t>
+      </w:r>
+    </w:p>
+    <w:p>
+      <w:r>
+        <w:t>Greyanna's jaw tightened as though the Matron Mother's words had slapped her.</w:t>
+      </w:r>
+    </w:p>
+    <w:p>
+      <w:r>
+        <w:t>“If he reaches,” the Matron Mother continued, “you will suppress the manifestation.”</w:t>
+      </w:r>
+    </w:p>
+    <w:p>
+      <w:r>
+        <w:t>“Yes, Matron Mother,” the sisters said simultaneously.</w:t>
       </w:r>
     </w:p>
     <w:p>

</xml_diff>